<commit_message>
feat: synchronize UGB official database initialization and dynamize subjects with Senegalese context
</commit_message>
<xml_diff>
--- a/Rapport_Projet_Tutores_M2_GDIL.docx
+++ b/Rapport_Projet_Tutores_M2_GDIL.docx
@@ -5243,7 +5243,7 @@
                 <w:sz w:val="20"/>
                 <w:szCs w:val="20"/>
               </w:rPr>
-              <w:t xml:space="preserve">Description du Profil</w:t>
+              <w:t xml:space="preserve">Matricule / Profil</w:t>
             </w:r>
           </w:p>
         </w:tc>
@@ -5269,7 +5269,7 @@
                 <w:sz w:val="19"/>
                 <w:szCs w:val="19"/>
               </w:rPr>
-              <w:t xml:space="preserve">ETUDIANT</w:t>
+              <w:t xml:space="preserve">ADMIN</w:t>
             </w:r>
           </w:p>
         </w:tc>
@@ -5293,7 +5293,7 @@
                 <w:sz w:val="19"/>
                 <w:szCs w:val="19"/>
               </w:rPr>
-              <w:t xml:space="preserve">Badji Alioune Badara</w:t>
+              <w:t xml:space="preserve">Ndiaye Cheikh Tidiane</w:t>
             </w:r>
           </w:p>
         </w:tc>
@@ -5317,7 +5317,7 @@
                 <w:sz w:val="19"/>
                 <w:szCs w:val="19"/>
               </w:rPr>
-              <w:t xml:space="preserve">badji.alioune-badara@ugb.edu.sn</w:t>
+              <w:t xml:space="preserve">cheikh-tidiane.ndiaye@ugb.edu.sn</w:t>
             </w:r>
           </w:p>
         </w:tc>
@@ -5341,7 +5341,7 @@
                 <w:sz w:val="19"/>
                 <w:szCs w:val="19"/>
               </w:rPr>
-              <w:t xml:space="preserve">Étudiant M2 GDIL - Candidat</w:t>
+              <w:t xml:space="preserve">Direction Informatique / ENT</w:t>
             </w:r>
           </w:p>
         </w:tc>
@@ -5367,7 +5367,7 @@
                 <w:sz w:val="19"/>
                 <w:szCs w:val="19"/>
               </w:rPr>
-              <w:t xml:space="preserve">ETUDIANT</w:t>
+              <w:t xml:space="preserve">RESPONSABLE</w:t>
             </w:r>
           </w:p>
         </w:tc>
@@ -5391,7 +5391,7 @@
                 <w:sz w:val="19"/>
                 <w:szCs w:val="19"/>
               </w:rPr>
-              <w:t xml:space="preserve">Fall Fatou</w:t>
+              <w:t xml:space="preserve">Dr. Sow Aminata</w:t>
             </w:r>
           </w:p>
         </w:tc>
@@ -5415,7 +5415,7 @@
                 <w:sz w:val="19"/>
                 <w:szCs w:val="19"/>
               </w:rPr>
-              <w:t xml:space="preserve">fall.fatou@ugb.edu.sn</w:t>
+              <w:t xml:space="preserve">aminata.sow@ugb.edu.sn</w:t>
             </w:r>
           </w:p>
         </w:tc>
@@ -5439,7 +5439,7 @@
                 <w:sz w:val="19"/>
                 <w:szCs w:val="19"/>
               </w:rPr>
-              <w:t xml:space="preserve">Étudiante M2 GDIL - Candidate</w:t>
+              <w:t xml:space="preserve">Responsable Pédagogique M2 GDIL</w:t>
             </w:r>
           </w:p>
         </w:tc>
@@ -5489,7 +5489,7 @@
                 <w:sz w:val="19"/>
                 <w:szCs w:val="19"/>
               </w:rPr>
-              <w:t xml:space="preserve">Dr. Diop Moussa</w:t>
+              <w:t xml:space="preserve">Pr. Diop Moussa</w:t>
             </w:r>
           </w:p>
         </w:tc>
@@ -5513,7 +5513,7 @@
                 <w:sz w:val="19"/>
                 <w:szCs w:val="19"/>
               </w:rPr>
-              <w:t xml:space="preserve">diop.moussa@ugb.edu.sn</w:t>
+              <w:t xml:space="preserve">moussa.diop@ugb.edu.sn</w:t>
             </w:r>
           </w:p>
         </w:tc>
@@ -5537,7 +5537,7 @@
                 <w:sz w:val="19"/>
                 <w:szCs w:val="19"/>
               </w:rPr>
-              <w:t xml:space="preserve">Enseignant-Chercheur - Proposant</w:t>
+              <w:t xml:space="preserve">ENS-UGB-042 - Informatique UFR SAT</w:t>
             </w:r>
           </w:p>
         </w:tc>
@@ -5563,7 +5563,7 @@
                 <w:sz w:val="19"/>
                 <w:szCs w:val="19"/>
               </w:rPr>
-              <w:t xml:space="preserve">RESPONSABLE</w:t>
+              <w:t xml:space="preserve">ETUDIANT</w:t>
             </w:r>
           </w:p>
         </w:tc>
@@ -5587,7 +5587,7 @@
                 <w:sz w:val="19"/>
                 <w:szCs w:val="19"/>
               </w:rPr>
-              <w:t xml:space="preserve">Dr. Sow Aminata</w:t>
+              <w:t xml:space="preserve">Touré Mamadou Alpha</w:t>
             </w:r>
           </w:p>
         </w:tc>
@@ -5611,7 +5611,7 @@
                 <w:sz w:val="19"/>
                 <w:szCs w:val="19"/>
               </w:rPr>
-              <w:t xml:space="preserve">sow.aminata@ugb.edu.sn</w:t>
+              <w:t xml:space="preserve">toure.mamadou-alpha@ugb.edu.sn</w:t>
             </w:r>
           </w:p>
         </w:tc>
@@ -5635,7 +5635,7 @@
                 <w:sz w:val="19"/>
                 <w:szCs w:val="19"/>
               </w:rPr>
-              <w:t xml:space="preserve">Responsable Pédagogique M2 - Arbitrage</w:t>
+              <w:t xml:space="preserve">P300001 - M2 Génie Informatique</w:t>
             </w:r>
           </w:p>
         </w:tc>
@@ -5661,7 +5661,7 @@
                 <w:sz w:val="19"/>
                 <w:szCs w:val="19"/>
               </w:rPr>
-              <w:t xml:space="preserve">ADMIN</w:t>
+              <w:t xml:space="preserve">ETUDIANT</w:t>
             </w:r>
           </w:p>
         </w:tc>
@@ -5685,7 +5685,7 @@
                 <w:sz w:val="19"/>
                 <w:szCs w:val="19"/>
               </w:rPr>
-              <w:t xml:space="preserve">Administrateur UGB</w:t>
+              <w:t xml:space="preserve">Ndiaye Fatou Marie</w:t>
             </w:r>
           </w:p>
         </w:tc>
@@ -5709,7 +5709,7 @@
                 <w:sz w:val="19"/>
                 <w:szCs w:val="19"/>
               </w:rPr>
-              <w:t xml:space="preserve">admin.ugb@ugb.edu.sn</w:t>
+              <w:t xml:space="preserve">ndiaye.fatou-marie@ugb.edu.sn</w:t>
             </w:r>
           </w:p>
         </w:tc>
@@ -5733,7 +5733,7 @@
                 <w:sz w:val="19"/>
                 <w:szCs w:val="19"/>
               </w:rPr>
-              <w:t xml:space="preserve">Administrateur Système / ENT</w:t>
+              <w:t xml:space="preserve">P310045 - M2 Génie Informatique</w:t>
             </w:r>
           </w:p>
         </w:tc>

</xml_diff>